<commit_message>
Collection receipt format: existing (Customer) vs proposed (Payer)
Co-Authored-By: Claude Sonnet 5.5 <noreply@anthropic.com>
Claude-Session: https://claude.ai/code/session_01UNYgRRspK6mAkfUf7oZq44
</commit_message>
<xml_diff>
--- a/Format_of_Collection_Receipt.docx
+++ b/Format_of_Collection_Receipt.docx
@@ -32,8 +32,488 @@
       </w:r>
     </w:p>
     <w:p>
+      <w:r>
+        <w:rPr>
+          <w:rFonts w:ascii="Verdana" w:hAnsi="Verdana" w:eastAsia="Verdana"/>
+          <w:b/>
+          <w:i w:val="0"/>
+          <w:color w:val="1F4E78"/>
+          <w:sz w:val="20"/>
+        </w:rPr>
+        <w:t>Existing format (Customer) and proposed format (Payer)</w:t>
+      </w:r>
+    </w:p>
+    <w:tbl>
+      <w:tblPr>
+        <w:tblStyle w:val="TableGrid"/>
+        <w:tblW w:type="auto" w:w="0"/>
+        <w:tblLook w:firstColumn="1" w:firstRow="1" w:lastColumn="0" w:lastRow="0" w:noHBand="0" w:noVBand="1" w:val="04A0"/>
+      </w:tblPr>
+      <w:tblGrid>
+        <w:gridCol w:w="3312"/>
+        <w:gridCol w:w="3312"/>
+        <w:gridCol w:w="3312"/>
+      </w:tblGrid>
+      <w:tr>
+        <w:tc>
+          <w:tcPr>
+            <w:tcW w:type="dxa" w:w="2592"/>
+            <w:shd w:val="clear" w:fill="1F4E78"/>
+          </w:tcPr>
+          <w:p>
+            <w:r>
+              <w:rPr>
+                <w:rFonts w:ascii="Verdana" w:hAnsi="Verdana" w:eastAsia="Verdana"/>
+                <w:b/>
+                <w:i w:val="0"/>
+                <w:color w:val="FFFFFF"/>
+                <w:sz w:val="18"/>
+              </w:rPr>
+              <w:t>Receipt detail</w:t>
+            </w:r>
+          </w:p>
+        </w:tc>
+        <w:tc>
+          <w:tcPr>
+            <w:tcW w:type="dxa" w:w="3600"/>
+            <w:shd w:val="clear" w:fill="1F4E78"/>
+          </w:tcPr>
+          <w:p>
+            <w:r>
+              <w:rPr>
+                <w:rFonts w:ascii="Verdana" w:hAnsi="Verdana" w:eastAsia="Verdana"/>
+                <w:b/>
+                <w:i w:val="0"/>
+                <w:color w:val="FFFFFF"/>
+                <w:sz w:val="18"/>
+              </w:rPr>
+              <w:t>Existing format (Customer)</w:t>
+            </w:r>
+          </w:p>
+        </w:tc>
+        <w:tc>
+          <w:tcPr>
+            <w:tcW w:type="dxa" w:w="3600"/>
+            <w:shd w:val="clear" w:fill="1F4E78"/>
+          </w:tcPr>
+          <w:p>
+            <w:r>
+              <w:rPr>
+                <w:rFonts w:ascii="Verdana" w:hAnsi="Verdana" w:eastAsia="Verdana"/>
+                <w:b/>
+                <w:i w:val="0"/>
+                <w:color w:val="FFFFFF"/>
+                <w:sz w:val="18"/>
+              </w:rPr>
+              <w:t>Proposed format (Payer)</w:t>
+            </w:r>
+          </w:p>
+        </w:tc>
+      </w:tr>
+      <w:tr>
+        <w:tc>
+          <w:tcPr>
+            <w:tcW w:type="dxa" w:w="2592"/>
+          </w:tcPr>
+          <w:p>
+            <w:r>
+              <w:rPr>
+                <w:rFonts w:ascii="Verdana" w:hAnsi="Verdana" w:eastAsia="Verdana"/>
+                <w:b w:val="0"/>
+                <w:i w:val="0"/>
+                <w:sz w:val="17"/>
+              </w:rPr>
+              <w:t>Code</w:t>
+            </w:r>
+          </w:p>
+        </w:tc>
+        <w:tc>
+          <w:tcPr>
+            <w:tcW w:type="dxa" w:w="3600"/>
+          </w:tcPr>
+          <w:p>
+            <w:r>
+              <w:rPr>
+                <w:rFonts w:ascii="Verdana" w:hAnsi="Verdana" w:eastAsia="Verdana"/>
+                <w:b w:val="0"/>
+                <w:i w:val="0"/>
+                <w:sz w:val="17"/>
+              </w:rPr>
+              <w:t>Customer Code</w:t>
+            </w:r>
+          </w:p>
+        </w:tc>
+        <w:tc>
+          <w:tcPr>
+            <w:tcW w:type="dxa" w:w="3600"/>
+          </w:tcPr>
+          <w:p>
+            <w:r>
+              <w:rPr>
+                <w:rFonts w:ascii="Verdana" w:hAnsi="Verdana" w:eastAsia="Verdana"/>
+                <w:b w:val="0"/>
+                <w:i w:val="0"/>
+                <w:sz w:val="17"/>
+              </w:rPr>
+              <w:t>Payer Code</w:t>
+            </w:r>
+          </w:p>
+        </w:tc>
+      </w:tr>
+      <w:tr>
+        <w:tc>
+          <w:tcPr>
+            <w:tcW w:type="dxa" w:w="2592"/>
+          </w:tcPr>
+          <w:p>
+            <w:r>
+              <w:rPr>
+                <w:rFonts w:ascii="Verdana" w:hAnsi="Verdana" w:eastAsia="Verdana"/>
+                <w:b w:val="0"/>
+                <w:i w:val="0"/>
+                <w:sz w:val="17"/>
+              </w:rPr>
+              <w:t>Name</w:t>
+            </w:r>
+          </w:p>
+        </w:tc>
+        <w:tc>
+          <w:tcPr>
+            <w:tcW w:type="dxa" w:w="3600"/>
+          </w:tcPr>
+          <w:p>
+            <w:r>
+              <w:rPr>
+                <w:rFonts w:ascii="Verdana" w:hAnsi="Verdana" w:eastAsia="Verdana"/>
+                <w:b w:val="0"/>
+                <w:i w:val="0"/>
+                <w:sz w:val="17"/>
+              </w:rPr>
+              <w:t>Customer Name</w:t>
+            </w:r>
+          </w:p>
+        </w:tc>
+        <w:tc>
+          <w:tcPr>
+            <w:tcW w:type="dxa" w:w="3600"/>
+          </w:tcPr>
+          <w:p>
+            <w:r>
+              <w:rPr>
+                <w:rFonts w:ascii="Verdana" w:hAnsi="Verdana" w:eastAsia="Verdana"/>
+                <w:b w:val="0"/>
+                <w:i w:val="0"/>
+                <w:sz w:val="17"/>
+              </w:rPr>
+              <w:t>Payer Name</w:t>
+            </w:r>
+          </w:p>
+        </w:tc>
+      </w:tr>
+      <w:tr>
+        <w:tc>
+          <w:tcPr>
+            <w:tcW w:type="dxa" w:w="2592"/>
+          </w:tcPr>
+          <w:p>
+            <w:r>
+              <w:rPr>
+                <w:rFonts w:ascii="Verdana" w:hAnsi="Verdana" w:eastAsia="Verdana"/>
+                <w:b w:val="0"/>
+                <w:i w:val="0"/>
+                <w:sz w:val="17"/>
+              </w:rPr>
+              <w:t>Address</w:t>
+            </w:r>
+          </w:p>
+        </w:tc>
+        <w:tc>
+          <w:tcPr>
+            <w:tcW w:type="dxa" w:w="3600"/>
+          </w:tcPr>
+          <w:p>
+            <w:r>
+              <w:rPr>
+                <w:rFonts w:ascii="Verdana" w:hAnsi="Verdana" w:eastAsia="Verdana"/>
+                <w:b w:val="0"/>
+                <w:i w:val="0"/>
+                <w:sz w:val="17"/>
+              </w:rPr>
+              <w:t>Customer Address</w:t>
+            </w:r>
+          </w:p>
+        </w:tc>
+        <w:tc>
+          <w:tcPr>
+            <w:tcW w:type="dxa" w:w="3600"/>
+          </w:tcPr>
+          <w:p>
+            <w:r>
+              <w:rPr>
+                <w:rFonts w:ascii="Verdana" w:hAnsi="Verdana" w:eastAsia="Verdana"/>
+                <w:b w:val="0"/>
+                <w:i w:val="0"/>
+                <w:sz w:val="17"/>
+              </w:rPr>
+              <w:t>Payer Address</w:t>
+            </w:r>
+          </w:p>
+        </w:tc>
+      </w:tr>
+      <w:tr>
+        <w:tc>
+          <w:tcPr>
+            <w:tcW w:type="dxa" w:w="2592"/>
+          </w:tcPr>
+          <w:p>
+            <w:r>
+              <w:rPr>
+                <w:rFonts w:ascii="Verdana" w:hAnsi="Verdana" w:eastAsia="Verdana"/>
+                <w:b w:val="0"/>
+                <w:i w:val="0"/>
+                <w:sz w:val="17"/>
+              </w:rPr>
+              <w:t>Collection No</w:t>
+            </w:r>
+          </w:p>
+        </w:tc>
+        <w:tc>
+          <w:tcPr>
+            <w:tcW w:type="dxa" w:w="3600"/>
+          </w:tcPr>
+          <w:p>
+            <w:r>
+              <w:rPr>
+                <w:rFonts w:ascii="Verdana" w:hAnsi="Verdana" w:eastAsia="Verdana"/>
+                <w:b w:val="0"/>
+                <w:i w:val="0"/>
+                <w:sz w:val="17"/>
+              </w:rPr>
+              <w:t>Collection No</w:t>
+            </w:r>
+          </w:p>
+        </w:tc>
+        <w:tc>
+          <w:tcPr>
+            <w:tcW w:type="dxa" w:w="3600"/>
+          </w:tcPr>
+          <w:p>
+            <w:r>
+              <w:rPr>
+                <w:rFonts w:ascii="Verdana" w:hAnsi="Verdana" w:eastAsia="Verdana"/>
+                <w:b w:val="0"/>
+                <w:i w:val="0"/>
+                <w:sz w:val="17"/>
+              </w:rPr>
+              <w:t>Collection No</w:t>
+            </w:r>
+          </w:p>
+        </w:tc>
+      </w:tr>
+      <w:tr>
+        <w:tc>
+          <w:tcPr>
+            <w:tcW w:type="dxa" w:w="2592"/>
+          </w:tcPr>
+          <w:p>
+            <w:r>
+              <w:rPr>
+                <w:rFonts w:ascii="Verdana" w:hAnsi="Verdana" w:eastAsia="Verdana"/>
+                <w:b w:val="0"/>
+                <w:i w:val="0"/>
+                <w:sz w:val="17"/>
+              </w:rPr>
+              <w:t>Collection Date</w:t>
+            </w:r>
+          </w:p>
+        </w:tc>
+        <w:tc>
+          <w:tcPr>
+            <w:tcW w:type="dxa" w:w="3600"/>
+          </w:tcPr>
+          <w:p>
+            <w:r>
+              <w:rPr>
+                <w:rFonts w:ascii="Verdana" w:hAnsi="Verdana" w:eastAsia="Verdana"/>
+                <w:b w:val="0"/>
+                <w:i w:val="0"/>
+                <w:sz w:val="17"/>
+              </w:rPr>
+              <w:t>Collection Date</w:t>
+            </w:r>
+          </w:p>
+        </w:tc>
+        <w:tc>
+          <w:tcPr>
+            <w:tcW w:type="dxa" w:w="3600"/>
+          </w:tcPr>
+          <w:p>
+            <w:r>
+              <w:rPr>
+                <w:rFonts w:ascii="Verdana" w:hAnsi="Verdana" w:eastAsia="Verdana"/>
+                <w:b w:val="0"/>
+                <w:i w:val="0"/>
+                <w:sz w:val="17"/>
+              </w:rPr>
+              <w:t>Collection Date (Receipt Date)</w:t>
+            </w:r>
+          </w:p>
+        </w:tc>
+      </w:tr>
+      <w:tr>
+        <w:tc>
+          <w:tcPr>
+            <w:tcW w:type="dxa" w:w="2592"/>
+          </w:tcPr>
+          <w:p>
+            <w:r>
+              <w:rPr>
+                <w:rFonts w:ascii="Verdana" w:hAnsi="Verdana" w:eastAsia="Verdana"/>
+                <w:b w:val="0"/>
+                <w:i w:val="0"/>
+                <w:sz w:val="17"/>
+              </w:rPr>
+              <w:t>Amount Collected</w:t>
+            </w:r>
+          </w:p>
+        </w:tc>
+        <w:tc>
+          <w:tcPr>
+            <w:tcW w:type="dxa" w:w="3600"/>
+          </w:tcPr>
+          <w:p>
+            <w:r>
+              <w:rPr>
+                <w:rFonts w:ascii="Verdana" w:hAnsi="Verdana" w:eastAsia="Verdana"/>
+                <w:b w:val="0"/>
+                <w:i w:val="0"/>
+                <w:sz w:val="17"/>
+              </w:rPr>
+              <w:t>Amount Collected</w:t>
+            </w:r>
+          </w:p>
+        </w:tc>
+        <w:tc>
+          <w:tcPr>
+            <w:tcW w:type="dxa" w:w="3600"/>
+          </w:tcPr>
+          <w:p>
+            <w:r>
+              <w:rPr>
+                <w:rFonts w:ascii="Verdana" w:hAnsi="Verdana" w:eastAsia="Verdana"/>
+                <w:b w:val="0"/>
+                <w:i w:val="0"/>
+                <w:sz w:val="17"/>
+              </w:rPr>
+              <w:t>Amount Collected</w:t>
+            </w:r>
+          </w:p>
+        </w:tc>
+      </w:tr>
+      <w:tr>
+        <w:tc>
+          <w:tcPr>
+            <w:tcW w:type="dxa" w:w="2592"/>
+          </w:tcPr>
+          <w:p>
+            <w:r>
+              <w:rPr>
+                <w:rFonts w:ascii="Verdana" w:hAnsi="Verdana" w:eastAsia="Verdana"/>
+                <w:b w:val="0"/>
+                <w:i w:val="0"/>
+                <w:sz w:val="17"/>
+              </w:rPr>
+              <w:t>Amount in Words</w:t>
+            </w:r>
+          </w:p>
+        </w:tc>
+        <w:tc>
+          <w:tcPr>
+            <w:tcW w:type="dxa" w:w="3600"/>
+          </w:tcPr>
+          <w:p>
+            <w:r>
+              <w:rPr>
+                <w:rFonts w:ascii="Verdana" w:hAnsi="Verdana" w:eastAsia="Verdana"/>
+                <w:b w:val="0"/>
+                <w:i w:val="0"/>
+                <w:sz w:val="17"/>
+              </w:rPr>
+              <w:t>Amount in Words</w:t>
+            </w:r>
+          </w:p>
+        </w:tc>
+        <w:tc>
+          <w:tcPr>
+            <w:tcW w:type="dxa" w:w="3600"/>
+          </w:tcPr>
+          <w:p>
+            <w:r>
+              <w:rPr>
+                <w:rFonts w:ascii="Verdana" w:hAnsi="Verdana" w:eastAsia="Verdana"/>
+                <w:b w:val="0"/>
+                <w:i w:val="0"/>
+                <w:sz w:val="17"/>
+              </w:rPr>
+              <w:t>Amount in Words</w:t>
+            </w:r>
+          </w:p>
+        </w:tc>
+      </w:tr>
+      <w:tr>
+        <w:tc>
+          <w:tcPr>
+            <w:tcW w:type="dxa" w:w="2592"/>
+          </w:tcPr>
+          <w:p>
+            <w:r>
+              <w:rPr>
+                <w:rFonts w:ascii="Verdana" w:hAnsi="Verdana" w:eastAsia="Verdana"/>
+                <w:b w:val="0"/>
+                <w:i w:val="0"/>
+                <w:sz w:val="17"/>
+              </w:rPr>
+              <w:t>Office/ Branch Code</w:t>
+            </w:r>
+          </w:p>
+        </w:tc>
+        <w:tc>
+          <w:tcPr>
+            <w:tcW w:type="dxa" w:w="3600"/>
+          </w:tcPr>
+          <w:p>
+            <w:r>
+              <w:rPr>
+                <w:rFonts w:ascii="Verdana" w:hAnsi="Verdana" w:eastAsia="Verdana"/>
+                <w:b w:val="0"/>
+                <w:i w:val="0"/>
+                <w:sz w:val="17"/>
+              </w:rPr>
+              <w:t>Office/ Branch Code</w:t>
+            </w:r>
+          </w:p>
+        </w:tc>
+        <w:tc>
+          <w:tcPr>
+            <w:tcW w:type="dxa" w:w="3600"/>
+          </w:tcPr>
+          <w:p>
+            <w:r>
+              <w:rPr>
+                <w:rFonts w:ascii="Verdana" w:hAnsi="Verdana" w:eastAsia="Verdana"/>
+                <w:b w:val="0"/>
+                <w:i w:val="0"/>
+                <w:sz w:val="17"/>
+              </w:rPr>
+              <w:t>Office/ Branch Code</w:t>
+            </w:r>
+          </w:p>
+        </w:tc>
+      </w:tr>
+    </w:tbl>
+    <w:p>
       <w:pPr>
-        <w:spacing w:before="160"/>
+        <w:spacing w:before="200"/>
       </w:pPr>
       <w:r>
         <w:rPr>
@@ -43,7 +523,7 @@
           <w:color w:val="1F4E78"/>
           <w:sz w:val="20"/>
         </w:rPr>
-        <w:t>Header</w:t>
+        <w:t>Proposed format: what is printed</w:t>
       </w:r>
     </w:p>
     <w:tbl>
@@ -53,40 +533,43 @@
         <w:tblLook w:firstColumn="1" w:firstRow="1" w:lastColumn="0" w:lastRow="0" w:noHBand="0" w:noVBand="1" w:val="04A0"/>
       </w:tblPr>
       <w:tblGrid>
-        <w:gridCol w:w="4824"/>
-        <w:gridCol w:w="4824"/>
+        <w:gridCol w:w="4968"/>
+        <w:gridCol w:w="4968"/>
       </w:tblGrid>
       <w:tr>
         <w:tc>
           <w:tcPr>
-            <w:tcW w:type="dxa" w:w="3168"/>
-            <w:shd w:val="clear" w:fill="F2F2F2"/>
+            <w:tcW w:type="dxa" w:w="2592"/>
+            <w:shd w:val="clear" w:fill="1F4E78"/>
           </w:tcPr>
           <w:p>
             <w:r>
               <w:rPr>
                 <w:rFonts w:ascii="Verdana" w:hAnsi="Verdana" w:eastAsia="Verdana"/>
-                <w:b w:val="0"/>
+                <w:b/>
                 <w:i w:val="0"/>
-                <w:sz w:val="17"/>
+                <w:color w:val="FFFFFF"/>
+                <w:sz w:val="18"/>
               </w:rPr>
-              <w:t>Company Logo / Company Name</w:t>
+              <w:t>Field</w:t>
             </w:r>
           </w:p>
         </w:tc>
         <w:tc>
           <w:tcPr>
-            <w:tcW w:type="dxa" w:w="6480"/>
+            <w:tcW w:type="dxa" w:w="7200"/>
+            <w:shd w:val="clear" w:fill="1F4E78"/>
           </w:tcPr>
           <w:p>
             <w:r>
               <w:rPr>
                 <w:rFonts w:ascii="Verdana" w:hAnsi="Verdana" w:eastAsia="Verdana"/>
-                <w:b w:val="0"/>
+                <w:b/>
                 <w:i w:val="0"/>
+                <w:color w:val="FFFFFF"/>
                 <w:sz w:val="18"/>
               </w:rPr>
-              <w:t>To be provided. Assume configurable on the template.</w:t>
+              <w:t>Assume this is</w:t>
             </w:r>
           </w:p>
         </w:tc>
@@ -94,69 +577,7 @@
       <w:tr>
         <w:tc>
           <w:tcPr>
-            <w:tcW w:type="dxa" w:w="3168"/>
-            <w:shd w:val="clear" w:fill="F2F2F2"/>
-          </w:tcPr>
-          <w:p>
-            <w:r>
-              <w:rPr>
-                <w:rFonts w:ascii="Verdana" w:hAnsi="Verdana" w:eastAsia="Verdana"/>
-                <w:b w:val="0"/>
-                <w:i w:val="0"/>
-                <w:sz w:val="17"/>
-              </w:rPr>
-              <w:t>Document Title</w:t>
-            </w:r>
-          </w:p>
-        </w:tc>
-        <w:tc>
-          <w:tcPr>
-            <w:tcW w:type="dxa" w:w="6480"/>
-          </w:tcPr>
-          <w:p>
-            <w:r>
-              <w:rPr>
-                <w:rFonts w:ascii="Verdana" w:hAnsi="Verdana" w:eastAsia="Verdana"/>
-                <w:b w:val="0"/>
-                <w:i w:val="0"/>
-                <w:sz w:val="18"/>
-              </w:rPr>
-              <w:t>Collection Receipt (fixed wording)</w:t>
-            </w:r>
-          </w:p>
-        </w:tc>
-      </w:tr>
-    </w:tbl>
-    <w:p>
-      <w:pPr>
-        <w:spacing w:before="160"/>
-      </w:pPr>
-      <w:r>
-        <w:rPr>
-          <w:rFonts w:ascii="Verdana" w:hAnsi="Verdana" w:eastAsia="Verdana"/>
-          <w:b/>
-          <w:i w:val="0"/>
-          <w:color w:val="1F4E78"/>
-          <w:sz w:val="20"/>
-        </w:rPr>
-        <w:t>Receipt Details</w:t>
-      </w:r>
-    </w:p>
-    <w:tbl>
-      <w:tblPr>
-        <w:tblStyle w:val="TableGrid"/>
-        <w:tblW w:type="auto" w:w="0"/>
-        <w:tblLook w:firstColumn="1" w:firstRow="1" w:lastColumn="0" w:lastRow="0" w:noHBand="0" w:noVBand="1" w:val="04A0"/>
-      </w:tblPr>
-      <w:tblGrid>
-        <w:gridCol w:w="4824"/>
-        <w:gridCol w:w="4824"/>
-      </w:tblGrid>
-      <w:tr>
-        <w:tc>
-          <w:tcPr>
-            <w:tcW w:type="dxa" w:w="3168"/>
-            <w:shd w:val="clear" w:fill="F2F2F2"/>
+            <w:tcW w:type="dxa" w:w="2592"/>
           </w:tcPr>
           <w:p>
             <w:r>
@@ -172,7 +593,7 @@
         </w:tc>
         <w:tc>
           <w:tcPr>
-            <w:tcW w:type="dxa" w:w="6480"/>
+            <w:tcW w:type="dxa" w:w="7200"/>
           </w:tcPr>
           <w:p>
             <w:r>
@@ -180,9 +601,9 @@
                 <w:rFonts w:ascii="Verdana" w:hAnsi="Verdana" w:eastAsia="Verdana"/>
                 <w:b w:val="0"/>
                 <w:i w:val="0"/>
-                <w:sz w:val="18"/>
+                <w:sz w:val="17"/>
               </w:rPr>
-              <w:t>Assume this is the code of the party making the payment (customer or agent/intermediary).</w:t>
+              <w:t>Code of the party making the payment: a customer or an agent/intermediary.</w:t>
             </w:r>
           </w:p>
         </w:tc>
@@ -190,8 +611,7 @@
       <w:tr>
         <w:tc>
           <w:tcPr>
-            <w:tcW w:type="dxa" w:w="3168"/>
-            <w:shd w:val="clear" w:fill="F2F2F2"/>
+            <w:tcW w:type="dxa" w:w="2592"/>
           </w:tcPr>
           <w:p>
             <w:r>
@@ -207,7 +627,7 @@
         </w:tc>
         <w:tc>
           <w:tcPr>
-            <w:tcW w:type="dxa" w:w="6480"/>
+            <w:tcW w:type="dxa" w:w="7200"/>
           </w:tcPr>
           <w:p>
             <w:r>
@@ -215,9 +635,9 @@
                 <w:rFonts w:ascii="Verdana" w:hAnsi="Verdana" w:eastAsia="Verdana"/>
                 <w:b w:val="0"/>
                 <w:i w:val="0"/>
-                <w:sz w:val="18"/>
+                <w:sz w:val="17"/>
               </w:rPr>
-              <w:t>Assume this is the name of the party making the payment (customer or agent/intermediary).</w:t>
+              <w:t>Name of the party making the payment: a customer or an agent/intermediary.</w:t>
             </w:r>
           </w:p>
         </w:tc>
@@ -225,8 +645,7 @@
       <w:tr>
         <w:tc>
           <w:tcPr>
-            <w:tcW w:type="dxa" w:w="3168"/>
-            <w:shd w:val="clear" w:fill="F2F2F2"/>
+            <w:tcW w:type="dxa" w:w="2592"/>
           </w:tcPr>
           <w:p>
             <w:r>
@@ -242,26 +661,7 @@
         </w:tc>
         <w:tc>
           <w:tcPr>
-            <w:tcW w:type="dxa" w:w="6480"/>
-          </w:tcPr>
-          <w:p>
-            <w:r>
-              <w:rPr>
-                <w:rFonts w:ascii="Verdana" w:hAnsi="Verdana" w:eastAsia="Verdana"/>
-                <w:b w:val="0"/>
-                <w:i w:val="0"/>
-                <w:sz w:val="18"/>
-              </w:rPr>
-              <w:t>Assume this is the address of the payer, combining Address Line 1, 2, 3, City, District, State and PIN Code.</w:t>
-            </w:r>
-          </w:p>
-        </w:tc>
-      </w:tr>
-      <w:tr>
-        <w:tc>
-          <w:tcPr>
-            <w:tcW w:type="dxa" w:w="3168"/>
-            <w:shd w:val="clear" w:fill="F2F2F2"/>
+            <w:tcW w:type="dxa" w:w="7200"/>
           </w:tcPr>
           <w:p>
             <w:r>
@@ -271,23 +671,7 @@
                 <w:i w:val="0"/>
                 <w:sz w:val="17"/>
               </w:rPr>
-              <w:t>Collection No</w:t>
-            </w:r>
-          </w:p>
-        </w:tc>
-        <w:tc>
-          <w:tcPr>
-            <w:tcW w:type="dxa" w:w="6480"/>
-          </w:tcPr>
-          <w:p>
-            <w:r>
-              <w:rPr>
-                <w:rFonts w:ascii="Verdana" w:hAnsi="Verdana" w:eastAsia="Verdana"/>
-                <w:b w:val="0"/>
-                <w:i w:val="0"/>
-                <w:sz w:val="18"/>
-              </w:rPr>
-              <w:t>Assume this is the Receipt / Collection number generated by the system for the transaction.</w:t>
+              <w:t>Address of the payer, combining Address Line 1, 2, 3, City, District, State and PIN Code.</w:t>
             </w:r>
           </w:p>
         </w:tc>
@@ -295,8 +679,7 @@
       <w:tr>
         <w:tc>
           <w:tcPr>
-            <w:tcW w:type="dxa" w:w="3168"/>
-            <w:shd w:val="clear" w:fill="F2F2F2"/>
+            <w:tcW w:type="dxa" w:w="2592"/>
           </w:tcPr>
           <w:p>
             <w:r>
@@ -312,26 +695,7 @@
         </w:tc>
         <w:tc>
           <w:tcPr>
-            <w:tcW w:type="dxa" w:w="6480"/>
-          </w:tcPr>
-          <w:p>
-            <w:r>
-              <w:rPr>
-                <w:rFonts w:ascii="Verdana" w:hAnsi="Verdana" w:eastAsia="Verdana"/>
-                <w:b w:val="0"/>
-                <w:i w:val="0"/>
-                <w:sz w:val="18"/>
-              </w:rPr>
-              <w:t>Assume this is the Receipt Date of the collection.</w:t>
-            </w:r>
-          </w:p>
-        </w:tc>
-      </w:tr>
-      <w:tr>
-        <w:tc>
-          <w:tcPr>
-            <w:tcW w:type="dxa" w:w="3168"/>
-            <w:shd w:val="clear" w:fill="F2F2F2"/>
+            <w:tcW w:type="dxa" w:w="7200"/>
           </w:tcPr>
           <w:p>
             <w:r>
@@ -341,93 +705,7 @@
                 <w:i w:val="0"/>
                 <w:sz w:val="17"/>
               </w:rPr>
-              <w:t>Amount Collected</w:t>
-            </w:r>
-          </w:p>
-        </w:tc>
-        <w:tc>
-          <w:tcPr>
-            <w:tcW w:type="dxa" w:w="6480"/>
-          </w:tcPr>
-          <w:p>
-            <w:r>
-              <w:rPr>
-                <w:rFonts w:ascii="Verdana" w:hAnsi="Verdana" w:eastAsia="Verdana"/>
-                <w:b w:val="0"/>
-                <w:i w:val="0"/>
-                <w:sz w:val="18"/>
-              </w:rPr>
-              <w:t>Total amount received, in INR.</w:t>
-            </w:r>
-          </w:p>
-        </w:tc>
-      </w:tr>
-      <w:tr>
-        <w:tc>
-          <w:tcPr>
-            <w:tcW w:type="dxa" w:w="3168"/>
-            <w:shd w:val="clear" w:fill="F2F2F2"/>
-          </w:tcPr>
-          <w:p>
-            <w:r>
-              <w:rPr>
-                <w:rFonts w:ascii="Verdana" w:hAnsi="Verdana" w:eastAsia="Verdana"/>
-                <w:b w:val="0"/>
-                <w:i w:val="0"/>
-                <w:sz w:val="17"/>
-              </w:rPr>
-              <w:t>Amount in Words</w:t>
-            </w:r>
-          </w:p>
-        </w:tc>
-        <w:tc>
-          <w:tcPr>
-            <w:tcW w:type="dxa" w:w="6480"/>
-          </w:tcPr>
-          <w:p>
-            <w:r>
-              <w:rPr>
-                <w:rFonts w:ascii="Verdana" w:hAnsi="Verdana" w:eastAsia="Verdana"/>
-                <w:b w:val="0"/>
-                <w:i w:val="0"/>
-                <w:sz w:val="18"/>
-              </w:rPr>
-              <w:t>Amount collected converted to words.</w:t>
-            </w:r>
-          </w:p>
-        </w:tc>
-      </w:tr>
-      <w:tr>
-        <w:tc>
-          <w:tcPr>
-            <w:tcW w:type="dxa" w:w="3168"/>
-            <w:shd w:val="clear" w:fill="F2F2F2"/>
-          </w:tcPr>
-          <w:p>
-            <w:r>
-              <w:rPr>
-                <w:rFonts w:ascii="Verdana" w:hAnsi="Verdana" w:eastAsia="Verdana"/>
-                <w:b w:val="0"/>
-                <w:i w:val="0"/>
-                <w:sz w:val="17"/>
-              </w:rPr>
-              <w:t>Office / Branch Code</w:t>
-            </w:r>
-          </w:p>
-        </w:tc>
-        <w:tc>
-          <w:tcPr>
-            <w:tcW w:type="dxa" w:w="6480"/>
-          </w:tcPr>
-          <w:p>
-            <w:r>
-              <w:rPr>
-                <w:rFonts w:ascii="Verdana" w:hAnsi="Verdana" w:eastAsia="Verdana"/>
-                <w:b w:val="0"/>
-                <w:i w:val="0"/>
-                <w:sz w:val="18"/>
-              </w:rPr>
-              <w:t>Assume this is the code of the collecting branch.</w:t>
+              <w:t>Receipt Date of the collection.</w:t>
             </w:r>
           </w:p>
         </w:tc>
@@ -435,374 +713,7 @@
     </w:tbl>
     <w:p>
       <w:pPr>
-        <w:spacing w:before="160"/>
-      </w:pPr>
-      <w:r>
-        <w:rPr>
-          <w:rFonts w:ascii="Verdana" w:hAnsi="Verdana" w:eastAsia="Verdana"/>
-          <w:b/>
-          <w:i w:val="0"/>
-          <w:color w:val="1F4E78"/>
-          <w:sz w:val="20"/>
-        </w:rPr>
-        <w:t>Collection Detail</w:t>
-      </w:r>
-    </w:p>
-    <w:tbl>
-      <w:tblPr>
-        <w:tblStyle w:val="TableGrid"/>
-        <w:tblW w:type="auto" w:w="0"/>
-        <w:tblLook w:firstColumn="1" w:firstRow="1" w:lastColumn="0" w:lastRow="0" w:noHBand="0" w:noVBand="1" w:val="04A0"/>
-      </w:tblPr>
-      <w:tblGrid>
-        <w:gridCol w:w="4824"/>
-        <w:gridCol w:w="4824"/>
-      </w:tblGrid>
-      <w:tr>
-        <w:tc>
-          <w:tcPr>
-            <w:tcW w:type="dxa" w:w="3168"/>
-            <w:shd w:val="clear" w:fill="F2F2F2"/>
-          </w:tcPr>
-          <w:p>
-            <w:r>
-              <w:rPr>
-                <w:rFonts w:ascii="Verdana" w:hAnsi="Verdana" w:eastAsia="Verdana"/>
-                <w:b w:val="0"/>
-                <w:i w:val="0"/>
-                <w:sz w:val="17"/>
-              </w:rPr>
-              <w:t>Sr. No</w:t>
-            </w:r>
-          </w:p>
-        </w:tc>
-        <w:tc>
-          <w:tcPr>
-            <w:tcW w:type="dxa" w:w="6480"/>
-          </w:tcPr>
-          <w:p>
-            <w:r>
-              <w:rPr>
-                <w:rFonts w:ascii="Verdana" w:hAnsi="Verdana" w:eastAsia="Verdana"/>
-                <w:b w:val="0"/>
-                <w:i w:val="0"/>
-                <w:sz w:val="18"/>
-              </w:rPr>
-              <w:t>Line sequence.</w:t>
-            </w:r>
-          </w:p>
-        </w:tc>
-      </w:tr>
-      <w:tr>
-        <w:tc>
-          <w:tcPr>
-            <w:tcW w:type="dxa" w:w="3168"/>
-            <w:shd w:val="clear" w:fill="F2F2F2"/>
-          </w:tcPr>
-          <w:p>
-            <w:r>
-              <w:rPr>
-                <w:rFonts w:ascii="Verdana" w:hAnsi="Verdana" w:eastAsia="Verdana"/>
-                <w:b w:val="0"/>
-                <w:i w:val="0"/>
-                <w:sz w:val="17"/>
-              </w:rPr>
-              <w:t>Proposal Ref. No</w:t>
-            </w:r>
-          </w:p>
-        </w:tc>
-        <w:tc>
-          <w:tcPr>
-            <w:tcW w:type="dxa" w:w="6480"/>
-          </w:tcPr>
-          <w:p>
-            <w:r>
-              <w:rPr>
-                <w:rFonts w:ascii="Verdana" w:hAnsi="Verdana" w:eastAsia="Verdana"/>
-                <w:b w:val="0"/>
-                <w:i w:val="0"/>
-                <w:sz w:val="18"/>
-              </w:rPr>
-              <w:t>Assume this is the proposal number against which the deposit is received.</w:t>
-            </w:r>
-          </w:p>
-        </w:tc>
-      </w:tr>
-      <w:tr>
-        <w:tc>
-          <w:tcPr>
-            <w:tcW w:type="dxa" w:w="3168"/>
-            <w:shd w:val="clear" w:fill="F2F2F2"/>
-          </w:tcPr>
-          <w:p>
-            <w:r>
-              <w:rPr>
-                <w:rFonts w:ascii="Verdana" w:hAnsi="Verdana" w:eastAsia="Verdana"/>
-                <w:b w:val="0"/>
-                <w:i w:val="0"/>
-                <w:sz w:val="17"/>
-              </w:rPr>
-              <w:t>Intermediary Code</w:t>
-            </w:r>
-          </w:p>
-        </w:tc>
-        <w:tc>
-          <w:tcPr>
-            <w:tcW w:type="dxa" w:w="6480"/>
-          </w:tcPr>
-          <w:p>
-            <w:r>
-              <w:rPr>
-                <w:rFonts w:ascii="Verdana" w:hAnsi="Verdana" w:eastAsia="Verdana"/>
-                <w:b w:val="0"/>
-                <w:i w:val="0"/>
-                <w:sz w:val="18"/>
-              </w:rPr>
-              <w:t>Assume this is the code of the main agent / intermediary on the proposal.</w:t>
-            </w:r>
-          </w:p>
-        </w:tc>
-      </w:tr>
-      <w:tr>
-        <w:tc>
-          <w:tcPr>
-            <w:tcW w:type="dxa" w:w="3168"/>
-            <w:shd w:val="clear" w:fill="F2F2F2"/>
-          </w:tcPr>
-          <w:p>
-            <w:r>
-              <w:rPr>
-                <w:rFonts w:ascii="Verdana" w:hAnsi="Verdana" w:eastAsia="Verdana"/>
-                <w:b w:val="0"/>
-                <w:i w:val="0"/>
-                <w:sz w:val="17"/>
-              </w:rPr>
-              <w:t>Amount Collected (Rs.)</w:t>
-            </w:r>
-          </w:p>
-        </w:tc>
-        <w:tc>
-          <w:tcPr>
-            <w:tcW w:type="dxa" w:w="6480"/>
-          </w:tcPr>
-          <w:p>
-            <w:r>
-              <w:rPr>
-                <w:rFonts w:ascii="Verdana" w:hAnsi="Verdana" w:eastAsia="Verdana"/>
-                <w:b w:val="0"/>
-                <w:i w:val="0"/>
-                <w:sz w:val="18"/>
-              </w:rPr>
-              <w:t>Amount for the line.</w:t>
-            </w:r>
-          </w:p>
-        </w:tc>
-      </w:tr>
-      <w:tr>
-        <w:tc>
-          <w:tcPr>
-            <w:tcW w:type="dxa" w:w="3168"/>
-            <w:shd w:val="clear" w:fill="F2F2F2"/>
-          </w:tcPr>
-          <w:p>
-            <w:r>
-              <w:rPr>
-                <w:rFonts w:ascii="Verdana" w:hAnsi="Verdana" w:eastAsia="Verdana"/>
-                <w:b w:val="0"/>
-                <w:i w:val="0"/>
-                <w:sz w:val="17"/>
-              </w:rPr>
-              <w:t>Mode of Payment</w:t>
-            </w:r>
-          </w:p>
-        </w:tc>
-        <w:tc>
-          <w:tcPr>
-            <w:tcW w:type="dxa" w:w="6480"/>
-          </w:tcPr>
-          <w:p>
-            <w:r>
-              <w:rPr>
-                <w:rFonts w:ascii="Verdana" w:hAnsi="Verdana" w:eastAsia="Verdana"/>
-                <w:b w:val="0"/>
-                <w:i w:val="0"/>
-                <w:sz w:val="18"/>
-              </w:rPr>
-              <w:t>Cash / Cheque / Demand Draft etc.</w:t>
-            </w:r>
-          </w:p>
-        </w:tc>
-      </w:tr>
-      <w:tr>
-        <w:tc>
-          <w:tcPr>
-            <w:tcW w:type="dxa" w:w="3168"/>
-            <w:shd w:val="clear" w:fill="F2F2F2"/>
-          </w:tcPr>
-          <w:p>
-            <w:r>
-              <w:rPr>
-                <w:rFonts w:ascii="Verdana" w:hAnsi="Verdana" w:eastAsia="Verdana"/>
-                <w:b w:val="0"/>
-                <w:i w:val="0"/>
-                <w:sz w:val="17"/>
-              </w:rPr>
-              <w:t>Bank Name, CHQ/CC/DD No, CHQ/DD/BC Dt.</w:t>
-            </w:r>
-          </w:p>
-        </w:tc>
-        <w:tc>
-          <w:tcPr>
-            <w:tcW w:type="dxa" w:w="6480"/>
-          </w:tcPr>
-          <w:p>
-            <w:r>
-              <w:rPr>
-                <w:rFonts w:ascii="Verdana" w:hAnsi="Verdana" w:eastAsia="Verdana"/>
-                <w:b w:val="0"/>
-                <w:i w:val="0"/>
-                <w:sz w:val="18"/>
-              </w:rPr>
-              <w:t>Printed only for non-cash modes.</w:t>
-            </w:r>
-          </w:p>
-        </w:tc>
-      </w:tr>
-      <w:tr>
-        <w:tc>
-          <w:tcPr>
-            <w:tcW w:type="dxa" w:w="3168"/>
-            <w:shd w:val="clear" w:fill="F2F2F2"/>
-          </w:tcPr>
-          <w:p>
-            <w:r>
-              <w:rPr>
-                <w:rFonts w:ascii="Verdana" w:hAnsi="Verdana" w:eastAsia="Verdana"/>
-                <w:b w:val="0"/>
-                <w:i w:val="0"/>
-                <w:sz w:val="17"/>
-              </w:rPr>
-              <w:t>Remarks</w:t>
-            </w:r>
-          </w:p>
-        </w:tc>
-        <w:tc>
-          <w:tcPr>
-            <w:tcW w:type="dxa" w:w="6480"/>
-          </w:tcPr>
-          <w:p>
-            <w:r>
-              <w:rPr>
-                <w:rFonts w:ascii="Verdana" w:hAnsi="Verdana" w:eastAsia="Verdana"/>
-                <w:b w:val="0"/>
-                <w:i w:val="0"/>
-                <w:sz w:val="18"/>
-              </w:rPr>
-              <w:t>Free text.</w:t>
-            </w:r>
-          </w:p>
-        </w:tc>
-      </w:tr>
-    </w:tbl>
-    <w:p>
-      <w:pPr>
-        <w:spacing w:before="160"/>
-      </w:pPr>
-      <w:r>
-        <w:rPr>
-          <w:rFonts w:ascii="Verdana" w:hAnsi="Verdana" w:eastAsia="Verdana"/>
-          <w:b/>
-          <w:i w:val="0"/>
-          <w:color w:val="1F4E78"/>
-          <w:sz w:val="20"/>
-        </w:rPr>
-        <w:t>Footer</w:t>
-      </w:r>
-    </w:p>
-    <w:tbl>
-      <w:tblPr>
-        <w:tblStyle w:val="TableGrid"/>
-        <w:tblW w:type="auto" w:w="0"/>
-        <w:tblLook w:firstColumn="1" w:firstRow="1" w:lastColumn="0" w:lastRow="0" w:noHBand="0" w:noVBand="1" w:val="04A0"/>
-      </w:tblPr>
-      <w:tblGrid>
-        <w:gridCol w:w="4824"/>
-        <w:gridCol w:w="4824"/>
-      </w:tblGrid>
-      <w:tr>
-        <w:tc>
-          <w:tcPr>
-            <w:tcW w:type="dxa" w:w="3168"/>
-            <w:shd w:val="clear" w:fill="F2F2F2"/>
-          </w:tcPr>
-          <w:p>
-            <w:r>
-              <w:rPr>
-                <w:rFonts w:ascii="Verdana" w:hAnsi="Verdana" w:eastAsia="Verdana"/>
-                <w:b w:val="0"/>
-                <w:i w:val="0"/>
-                <w:sz w:val="17"/>
-              </w:rPr>
-              <w:t>Registered Office, IRDAI Regn. No., GSTIN, Customer Care, Claims, Email, Website</w:t>
-            </w:r>
-          </w:p>
-        </w:tc>
-        <w:tc>
-          <w:tcPr>
-            <w:tcW w:type="dxa" w:w="6480"/>
-          </w:tcPr>
-          <w:p>
-            <w:r>
-              <w:rPr>
-                <w:rFonts w:ascii="Verdana" w:hAnsi="Verdana" w:eastAsia="Verdana"/>
-                <w:b w:val="0"/>
-                <w:i w:val="0"/>
-                <w:sz w:val="18"/>
-              </w:rPr>
-              <w:t>To be provided. Assume configurable on the template.</w:t>
-            </w:r>
-          </w:p>
-        </w:tc>
-      </w:tr>
-      <w:tr>
-        <w:tc>
-          <w:tcPr>
-            <w:tcW w:type="dxa" w:w="3168"/>
-            <w:shd w:val="clear" w:fill="F2F2F2"/>
-          </w:tcPr>
-          <w:p>
-            <w:r>
-              <w:rPr>
-                <w:rFonts w:ascii="Verdana" w:hAnsi="Verdana" w:eastAsia="Verdana"/>
-                <w:b w:val="0"/>
-                <w:i w:val="0"/>
-                <w:sz w:val="17"/>
-              </w:rPr>
-              <w:t>System-generated statement and Note</w:t>
-            </w:r>
-          </w:p>
-        </w:tc>
-        <w:tc>
-          <w:tcPr>
-            <w:tcW w:type="dxa" w:w="6480"/>
-          </w:tcPr>
-          <w:p>
-            <w:r>
-              <w:rPr>
-                <w:rFonts w:ascii="Verdana" w:hAnsi="Verdana" w:eastAsia="Verdana"/>
-                <w:b w:val="0"/>
-                <w:i w:val="0"/>
-                <w:sz w:val="18"/>
-              </w:rPr>
-              <w:t>Fixed wording, as in the template.</w:t>
-            </w:r>
-          </w:p>
-        </w:tc>
-      </w:tr>
-    </w:tbl>
-    <w:p>
-      <w:pPr>
-        <w:spacing w:before="160"/>
+        <w:spacing w:before="200"/>
       </w:pPr>
       <w:r>
         <w:rPr>
@@ -815,140 +726,69 @@
         <w:t>Suggestions</w:t>
       </w:r>
     </w:p>
-    <w:tbl>
-      <w:tblPr>
-        <w:tblStyle w:val="TableGrid"/>
-        <w:tblW w:type="auto" w:w="0"/>
-        <w:tblLook w:firstColumn="1" w:firstRow="1" w:lastColumn="0" w:lastRow="0" w:noHBand="0" w:noVBand="1" w:val="04A0"/>
-      </w:tblPr>
-      <w:tblGrid>
-        <w:gridCol w:w="4824"/>
-        <w:gridCol w:w="4824"/>
-      </w:tblGrid>
-      <w:tr>
-        <w:tc>
-          <w:tcPr>
-            <w:tcW w:type="dxa" w:w="3168"/>
-            <w:shd w:val="clear" w:fill="F2F2F2"/>
-          </w:tcPr>
-          <w:p>
-            <w:r>
-              <w:rPr>
-                <w:rFonts w:ascii="Verdana" w:hAnsi="Verdana" w:eastAsia="Verdana"/>
-                <w:b w:val="0"/>
-                <w:i w:val="0"/>
-                <w:sz w:val="17"/>
-              </w:rPr>
-              <w:t>Payer Code / Payer Name</w:t>
-            </w:r>
-          </w:p>
-        </w:tc>
-        <w:tc>
-          <w:tcPr>
-            <w:tcW w:type="dxa" w:w="6480"/>
-          </w:tcPr>
-          <w:p>
-            <w:r>
-              <w:rPr>
-                <w:rFonts w:ascii="Verdana" w:hAnsi="Verdana" w:eastAsia="Verdana"/>
-                <w:b w:val="0"/>
-                <w:i/>
-                <w:color w:val="C00000"/>
-                <w:sz w:val="18"/>
-              </w:rPr>
-              <w:t>Suggest the same two fields cover both customers and agents/intermediaries making the payment.</w:t>
-            </w:r>
-          </w:p>
-          <w:p>
-            <w:r>
-              <w:rPr>
-                <w:rFonts w:ascii="Verdana" w:hAnsi="Verdana" w:eastAsia="Verdana"/>
-                <w:b w:val="0"/>
-                <w:i/>
-                <w:color w:val="C00000"/>
-                <w:sz w:val="18"/>
-              </w:rPr>
-              <w:t>Suggest confirming that this fits the business requirement.</w:t>
-            </w:r>
-          </w:p>
-        </w:tc>
-      </w:tr>
-      <w:tr>
-        <w:tc>
-          <w:tcPr>
-            <w:tcW w:type="dxa" w:w="3168"/>
-            <w:shd w:val="clear" w:fill="F2F2F2"/>
-          </w:tcPr>
-          <w:p>
-            <w:r>
-              <w:rPr>
-                <w:rFonts w:ascii="Verdana" w:hAnsi="Verdana" w:eastAsia="Verdana"/>
-                <w:b w:val="0"/>
-                <w:i w:val="0"/>
-                <w:sz w:val="17"/>
-              </w:rPr>
-              <w:t>Additional payer details</w:t>
-            </w:r>
-          </w:p>
-        </w:tc>
-        <w:tc>
-          <w:tcPr>
-            <w:tcW w:type="dxa" w:w="6480"/>
-          </w:tcPr>
-          <w:p>
-            <w:r>
-              <w:rPr>
-                <w:rFonts w:ascii="Verdana" w:hAnsi="Verdana" w:eastAsia="Verdana"/>
-                <w:b w:val="0"/>
-                <w:i/>
-                <w:color w:val="C00000"/>
-                <w:sz w:val="18"/>
-              </w:rPr>
-              <w:t>Suggest confirming whether any other payer details are needed on the receipt, such as Payer Type (Customer or Agent).</w:t>
-            </w:r>
-          </w:p>
-        </w:tc>
-      </w:tr>
-      <w:tr>
-        <w:tc>
-          <w:tcPr>
-            <w:tcW w:type="dxa" w:w="3168"/>
-            <w:shd w:val="clear" w:fill="F2F2F2"/>
-          </w:tcPr>
-          <w:p>
-            <w:r>
-              <w:rPr>
-                <w:rFonts w:ascii="Verdana" w:hAnsi="Verdana" w:eastAsia="Verdana"/>
-                <w:b w:val="0"/>
-                <w:i w:val="0"/>
-                <w:sz w:val="17"/>
-              </w:rPr>
-              <w:t>Payer Address</w:t>
-            </w:r>
-          </w:p>
-        </w:tc>
-        <w:tc>
-          <w:tcPr>
-            <w:tcW w:type="dxa" w:w="6480"/>
-          </w:tcPr>
-          <w:p>
-            <w:r>
-              <w:rPr>
-                <w:rFonts w:ascii="Verdana" w:hAnsi="Verdana" w:eastAsia="Verdana"/>
-                <w:b w:val="0"/>
-                <w:i/>
-                <w:color w:val="C00000"/>
-                <w:sz w:val="18"/>
-              </w:rPr>
-              <w:t>Suggest confirming the source of the payer address when the payer is an agent.</w:t>
-            </w:r>
-          </w:p>
-        </w:tc>
-      </w:tr>
-    </w:tbl>
+    <w:p>
+      <w:pPr>
+        <w:pStyle w:val="ListBullet"/>
+      </w:pPr>
+      <w:r>
+        <w:rPr>
+          <w:rFonts w:ascii="Verdana" w:hAnsi="Verdana" w:eastAsia="Verdana"/>
+          <w:b w:val="0"/>
+          <w:i/>
+          <w:color w:val="C00000"/>
+          <w:sz w:val="18"/>
+        </w:rPr>
+        <w:t>Suggest using the Payer fields on the receipt, so that payments by customers as well as by agents/intermediaries are covered by the same layout.</w:t>
+      </w:r>
+    </w:p>
+    <w:p>
+      <w:pPr>
+        <w:pStyle w:val="ListBullet"/>
+      </w:pPr>
+      <w:r>
+        <w:rPr>
+          <w:rFonts w:ascii="Verdana" w:hAnsi="Verdana" w:eastAsia="Verdana"/>
+          <w:b w:val="0"/>
+          <w:i/>
+          <w:color w:val="C00000"/>
+          <w:sz w:val="18"/>
+        </w:rPr>
+        <w:t>Suggest confirming that Payer Code and Payer Name fit the business requirement.</w:t>
+      </w:r>
+    </w:p>
+    <w:p>
+      <w:pPr>
+        <w:pStyle w:val="ListBullet"/>
+      </w:pPr>
+      <w:r>
+        <w:rPr>
+          <w:rFonts w:ascii="Verdana" w:hAnsi="Verdana" w:eastAsia="Verdana"/>
+          <w:b w:val="0"/>
+          <w:i/>
+          <w:color w:val="C00000"/>
+          <w:sz w:val="18"/>
+        </w:rPr>
+        <w:t>Suggest confirming whether any other payer details are needed on the receipt, such as Payer Type (Customer or Agent).</w:t>
+      </w:r>
+    </w:p>
+    <w:p>
+      <w:pPr>
+        <w:pStyle w:val="ListBullet"/>
+      </w:pPr>
+      <w:r>
+        <w:rPr>
+          <w:rFonts w:ascii="Verdana" w:hAnsi="Verdana" w:eastAsia="Verdana"/>
+          <w:b w:val="0"/>
+          <w:i/>
+          <w:color w:val="C00000"/>
+          <w:sz w:val="18"/>
+        </w:rPr>
+        <w:t>Suggest confirming the source of the payer address when the payer is an agent/intermediary.</w:t>
+      </w:r>
+    </w:p>
     <w:sectPr>
       <w:pgSz w:w="12240" w:h="15840"/>
-      <w:pgMar w:top="1440" w:right="1296" w:bottom="1440" w:left="1296" w:header="720" w:footer="720" w:gutter="0"/>
+      <w:pgMar w:top="1440" w:right="1152" w:bottom="1440" w:left="1152" w:header="720" w:footer="720" w:gutter="0"/>
       <w:cols w:space="720"/>
       <w:docGrid w:linePitch="360"/>
     </w:sectPr>
@@ -1321,7 +1161,6 @@
     <w:rsid w:val="00FC693F"/>
     <w:rPr>
       <w:rFonts w:ascii="Verdana" w:hAnsi="Verdana"/>
-      <w:sz w:val="18"/>
     </w:rPr>
   </w:style>
   <w:style w:type="paragraph" w:styleId="Header">

</xml_diff>